<commit_message>
docs: documentar #correo# agregado en plantilla carta_abandono
Se agrego la variable #correo# en carta_abandono.docx (antes solo
tenia direccion, sin correo). Se actualiza el listado de variables
por plantilla en variables_plantillas_word.md para reflejarlo.

Co-Authored-By: Claude Sonnet 5 <noreply@anthropic.com>
</commit_message>
<xml_diff>
--- a/docs/plantillas/carta_abandono.docx
+++ b/docs/plantillas/carta_abandono.docx
@@ -1,6 +1,6 @@
 
 <file path=word/document.xml><?xml version="1.0" encoding="utf-8"?>
-<w:document xmlns:wpc="http://schemas.microsoft.com/office/word/2010/wordprocessingCanvas" xmlns:cx="http://schemas.microsoft.com/office/drawing/2014/chartex" xmlns:cx1="http://schemas.microsoft.com/office/drawing/2015/9/8/chartex" xmlns:cx2="http://schemas.microsoft.com/office/drawing/2015/10/21/chartex" xmlns:cx3="http://schemas.microsoft.com/office/drawing/2016/5/9/chartex" xmlns:cx4="http://schemas.microsoft.com/office/drawing/2016/5/10/chartex" xmlns:cx5="http://schemas.microsoft.com/office/drawing/2016/5/11/chartex" xmlns:cx6="http://schemas.microsoft.com/office/drawing/2016/5/12/chartex" xmlns:cx7="http://schemas.microsoft.com/office/drawing/2016/5/13/chartex" xmlns:cx8="http://schemas.microsoft.com/office/drawing/2016/5/14/chartex" xmlns:mc="http://schemas.openxmlformats.org/markup-compatibility/2006" xmlns:aink="http://schemas.microsoft.com/office/drawing/2016/ink" xmlns:am3d="http://schemas.microsoft.com/office/drawing/2017/model3d" xmlns:o="urn:schemas-microsoft-com:office:office" xmlns:oel="http://schemas.microsoft.com/office/2019/extlst" xmlns:r="http://schemas.openxmlformats.org/officeDocument/2006/relationships" xmlns:m="http://schemas.openxmlformats.org/officeDocument/2006/math" xmlns:v="urn:schemas-microsoft-com:vml" xmlns:wp14="http://schemas.microsoft.com/office/word/2010/wordprocessingDrawing" xmlns:wp="http://schemas.openxmlformats.org/drawingml/2006/wordprocessingDrawing" xmlns:w10="urn:schemas-microsoft-com:office:word" xmlns:w="http://schemas.openxmlformats.org/wordprocessingml/2006/main" xmlns:w14="http://schemas.microsoft.com/office/word/2010/wordml" xmlns:w15="http://schemas.microsoft.com/office/word/2012/wordml" xmlns:w16cex="http://schemas.microsoft.com/office/word/2018/wordml/cex" xmlns:w16cid="http://schemas.microsoft.com/office/word/2016/wordml/cid" xmlns:w16="http://schemas.microsoft.com/office/word/2018/wordml" xmlns:w16du="http://schemas.microsoft.com/office/word/2023/wordml/word16du" xmlns:w16sdtdh="http://schemas.microsoft.com/office/word/2020/wordml/sdtdatahash" xmlns:w16se="http://schemas.microsoft.com/office/word/2015/wordml/symex" xmlns:wpg="http://schemas.microsoft.com/office/word/2010/wordprocessingGroup" xmlns:wpi="http://schemas.microsoft.com/office/word/2010/wordprocessingInk" xmlns:wne="http://schemas.microsoft.com/office/word/2006/wordml" xmlns:wps="http://schemas.microsoft.com/office/word/2010/wordprocessingShape" mc:Ignorable="w14 w15 w16se w16cid w16 w16cex w16sdtdh w16du wp14">
+<w:document xmlns:wpc="http://schemas.microsoft.com/office/word/2010/wordprocessingCanvas" xmlns:cx="http://schemas.microsoft.com/office/drawing/2014/chartex" xmlns:cx1="http://schemas.microsoft.com/office/drawing/2015/9/8/chartex" xmlns:cx2="http://schemas.microsoft.com/office/drawing/2015/10/21/chartex" xmlns:cx3="http://schemas.microsoft.com/office/drawing/2016/5/9/chartex" xmlns:cx4="http://schemas.microsoft.com/office/drawing/2016/5/10/chartex" xmlns:cx5="http://schemas.microsoft.com/office/drawing/2016/5/11/chartex" xmlns:cx6="http://schemas.microsoft.com/office/drawing/2016/5/12/chartex" xmlns:cx7="http://schemas.microsoft.com/office/drawing/2016/5/13/chartex" xmlns:cx8="http://schemas.microsoft.com/office/drawing/2016/5/14/chartex" xmlns:mc="http://schemas.openxmlformats.org/markup-compatibility/2006" xmlns:aink="http://schemas.microsoft.com/office/drawing/2016/ink" xmlns:am3d="http://schemas.microsoft.com/office/drawing/2017/model3d" xmlns:o="urn:schemas-microsoft-com:office:office" xmlns:r="http://schemas.openxmlformats.org/officeDocument/2006/relationships" xmlns:m="http://schemas.openxmlformats.org/officeDocument/2006/math" xmlns:v="urn:schemas-microsoft-com:vml" xmlns:wp14="http://schemas.microsoft.com/office/word/2010/wordprocessingDrawing" xmlns:wp="http://schemas.openxmlformats.org/drawingml/2006/wordprocessingDrawing" xmlns:w10="urn:schemas-microsoft-com:office:word" xmlns:w="http://schemas.openxmlformats.org/wordprocessingml/2006/main" xmlns:w14="http://schemas.microsoft.com/office/word/2010/wordml" xmlns:w15="http://schemas.microsoft.com/office/word/2012/wordml" xmlns:w16cex="http://schemas.microsoft.com/office/word/2018/wordml/cex" xmlns:w16cid="http://schemas.microsoft.com/office/word/2016/wordml/cid" xmlns:w16="http://schemas.microsoft.com/office/word/2018/wordml" xmlns:w16sdtdh="http://schemas.microsoft.com/office/word/2020/wordml/sdtdatahash" xmlns:w16se="http://schemas.microsoft.com/office/word/2015/wordml/symex" xmlns:wpg="http://schemas.microsoft.com/office/word/2010/wordprocessingGroup" xmlns:wpi="http://schemas.microsoft.com/office/word/2010/wordprocessingInk" xmlns:wne="http://schemas.microsoft.com/office/word/2006/wordml" xmlns:wps="http://schemas.microsoft.com/office/word/2010/wordprocessingShape" mc:Ignorable="w14 w15 w16se w16cid w16 w16cex w16sdtdh wp14">
   <w:body>
     <w:p>
       <w:pPr>
@@ -134,7 +134,7 @@
           <w:b/>
           <w:bCs/>
           <w:sz w:val="28"/>
-          <w:lang w:val="es-PE"/>
+          <w:lang w:val="pt-PT"/>
         </w:rPr>
       </w:pPr>
       <w:r>
@@ -144,7 +144,7 @@
           <w:bCs/>
           <w:noProof/>
           <w:sz w:val="28"/>
-          <w:lang w:val="es-PE"/>
+          <w:lang w:val="pt-PT"/>
         </w:rPr>
         <w:t>CARTA</w:t>
       </w:r>
@@ -154,7 +154,7 @@
           <w:b/>
           <w:bCs/>
           <w:sz w:val="28"/>
-          <w:lang w:val="es-PE"/>
+          <w:lang w:val="pt-PT"/>
         </w:rPr>
         <w:t xml:space="preserve">   Nº</w:t>
       </w:r>
@@ -164,7 +164,7 @@
           <w:b/>
           <w:bCs/>
           <w:sz w:val="28"/>
-          <w:lang w:val="es-PE"/>
+          <w:lang w:val="pt-PT"/>
         </w:rPr>
         <w:t xml:space="preserve">   </w:t>
       </w:r>
@@ -174,7 +174,7 @@
           <w:b/>
           <w:bCs/>
           <w:sz w:val="28"/>
-          <w:lang w:val="es-PE"/>
+          <w:lang w:val="pt-PT"/>
         </w:rPr>
         <w:t>XXXXX</w:t>
       </w:r>
@@ -184,7 +184,7 @@
           <w:b/>
           <w:bCs/>
           <w:sz w:val="28"/>
-          <w:lang w:val="es-PE"/>
+          <w:lang w:val="pt-PT"/>
         </w:rPr>
         <w:t xml:space="preserve"> </w:t>
       </w:r>
@@ -195,7 +195,7 @@
           <w:bCs/>
           <w:noProof/>
           <w:sz w:val="28"/>
-          <w:lang w:val="es-PE"/>
+          <w:lang w:val="pt-PT"/>
         </w:rPr>
         <w:t>-202</w:t>
       </w:r>
@@ -206,7 +206,7 @@
           <w:bCs/>
           <w:noProof/>
           <w:sz w:val="28"/>
-          <w:lang w:val="es-PE"/>
+          <w:lang w:val="pt-PT"/>
         </w:rPr>
         <w:t>6</w:t>
       </w:r>
@@ -217,7 +217,7 @@
           <w:bCs/>
           <w:noProof/>
           <w:sz w:val="28"/>
-          <w:lang w:val="es-PE"/>
+          <w:lang w:val="pt-PT"/>
         </w:rPr>
         <w:t>/</w:t>
       </w:r>
@@ -228,7 +228,7 @@
           <w:bCs/>
           <w:noProof/>
           <w:sz w:val="28"/>
-          <w:lang w:val="es-PE"/>
+          <w:lang w:val="pt-PT"/>
         </w:rPr>
         <w:t>D</w:t>
       </w:r>
@@ -239,7 +239,7 @@
           <w:bCs/>
           <w:noProof/>
           <w:sz w:val="28"/>
-          <w:lang w:val="es-PE"/>
+          <w:lang w:val="pt-PT"/>
         </w:rPr>
         <w:t>RC/S</w:t>
       </w:r>
@@ -250,7 +250,7 @@
           <w:bCs/>
           <w:noProof/>
           <w:sz w:val="28"/>
-          <w:lang w:val="es-PE"/>
+          <w:lang w:val="pt-PT"/>
         </w:rPr>
         <w:t>DRERC</w:t>
       </w:r>
@@ -260,7 +260,7 @@
           <w:b/>
           <w:bCs/>
           <w:sz w:val="28"/>
-          <w:lang w:val="es-PE"/>
+          <w:lang w:val="pt-PT"/>
         </w:rPr>
         <w:t>/RENIEC</w:t>
       </w:r>
@@ -273,7 +273,7 @@
           <w:b/>
           <w:bCs/>
           <w:sz w:val="22"/>
-          <w:lang w:val="es-PE"/>
+          <w:lang w:val="pt-PT"/>
         </w:rPr>
       </w:pPr>
     </w:p>
@@ -417,7 +417,7 @@
             <w:szCs w:val="22"/>
             <w:lang w:val="es-PE"/>
           </w:rPr>
-          <w:t>dinamarlenisantostapia@gmail.com</w:t>
+          <w:t>#correo#</w:t>
         </w:r>
       </w:hyperlink>
     </w:p>
@@ -1014,7 +1014,6 @@
         </w:rPr>
         <w:t xml:space="preserve">Reciba usted el saludo de la </w:t>
       </w:r>
-      <w:proofErr w:type="gramStart"/>
       <w:r>
         <w:rPr>
           <w:spacing w:val="-1"/>
@@ -1043,15 +1042,7 @@
           <w:sz w:val="22"/>
           <w:szCs w:val="22"/>
         </w:rPr>
-        <w:t>Dirección</w:t>
-      </w:r>
-      <w:proofErr w:type="gramEnd"/>
-      <w:r>
-        <w:rPr>
-          <w:sz w:val="22"/>
-          <w:szCs w:val="22"/>
-        </w:rPr>
-        <w:t xml:space="preserve"> de Recursos Registrales Civiles, y a la vez hacer de su conocimiento </w:t>
+        <w:t xml:space="preserve">Dirección de Recursos Registrales Civiles, y a la vez hacer de su conocimiento </w:t>
       </w:r>
       <w:r>
         <w:rPr>
@@ -1272,17 +1263,7 @@
           <w:szCs w:val="21"/>
           <w:lang w:val="es-PE" w:eastAsia="es-PE"/>
         </w:rPr>
-        <w:t xml:space="preserve"> importante precisar que la declaración de abandono del procedimiento </w:t>
-      </w:r>
-      <w:proofErr w:type="gramStart"/>
-      <w:r>
-        <w:rPr>
-          <w:rFonts w:ascii="Arial" w:hAnsi="Arial" w:cs="Arial"/>
-          <w:sz w:val="21"/>
-          <w:szCs w:val="21"/>
-          <w:lang w:val="es-PE" w:eastAsia="es-PE"/>
-        </w:rPr>
-        <w:t>administrativo</w:t>
+        <w:t xml:space="preserve"> importante precisar que la declaración de abandono del procedimiento administrativo</w:t>
       </w:r>
       <w:r>
         <w:rPr>
@@ -1291,17 +1272,7 @@
           <w:szCs w:val="21"/>
           <w:lang w:eastAsia="es-PE"/>
         </w:rPr>
-        <w:t>,</w:t>
-      </w:r>
-      <w:proofErr w:type="gramEnd"/>
-      <w:r>
-        <w:rPr>
-          <w:rFonts w:ascii="Arial" w:hAnsi="Arial" w:cs="Arial"/>
-          <w:sz w:val="21"/>
-          <w:szCs w:val="21"/>
-          <w:lang w:eastAsia="es-PE"/>
-        </w:rPr>
-        <w:t xml:space="preserve"> </w:t>
+        <w:t xml:space="preserve">, </w:t>
       </w:r>
       <w:r>
         <w:rPr>
@@ -1880,7 +1851,6 @@
         </w:rPr>
         <w:t>MPR/</w:t>
       </w:r>
-      <w:proofErr w:type="spellStart"/>
       <w:r>
         <w:rPr>
           <w:rFonts w:ascii="Arial" w:hAnsi="Arial" w:cs="Arial"/>
@@ -1891,7 +1861,6 @@
         </w:rPr>
         <w:t>jph</w:t>
       </w:r>
-      <w:proofErr w:type="spellEnd"/>
       <w:r>
         <w:rPr>
           <w:rFonts w:ascii="Arial" w:hAnsi="Arial" w:cs="Arial"/>
@@ -1933,7 +1902,7 @@
 </file>
 
 <file path=word/endnotes.xml><?xml version="1.0" encoding="utf-8"?>
-<w:endnotes xmlns:wpc="http://schemas.microsoft.com/office/word/2010/wordprocessingCanvas" xmlns:cx="http://schemas.microsoft.com/office/drawing/2014/chartex" xmlns:cx1="http://schemas.microsoft.com/office/drawing/2015/9/8/chartex" xmlns:cx2="http://schemas.microsoft.com/office/drawing/2015/10/21/chartex" xmlns:cx3="http://schemas.microsoft.com/office/drawing/2016/5/9/chartex" xmlns:cx4="http://schemas.microsoft.com/office/drawing/2016/5/10/chartex" xmlns:cx5="http://schemas.microsoft.com/office/drawing/2016/5/11/chartex" xmlns:cx6="http://schemas.microsoft.com/office/drawing/2016/5/12/chartex" xmlns:cx7="http://schemas.microsoft.com/office/drawing/2016/5/13/chartex" xmlns:cx8="http://schemas.microsoft.com/office/drawing/2016/5/14/chartex" xmlns:mc="http://schemas.openxmlformats.org/markup-compatibility/2006" xmlns:aink="http://schemas.microsoft.com/office/drawing/2016/ink" xmlns:am3d="http://schemas.microsoft.com/office/drawing/2017/model3d" xmlns:o="urn:schemas-microsoft-com:office:office" xmlns:oel="http://schemas.microsoft.com/office/2019/extlst" xmlns:r="http://schemas.openxmlformats.org/officeDocument/2006/relationships" xmlns:m="http://schemas.openxmlformats.org/officeDocument/2006/math" xmlns:v="urn:schemas-microsoft-com:vml" xmlns:wp14="http://schemas.microsoft.com/office/word/2010/wordprocessingDrawing" xmlns:wp="http://schemas.openxmlformats.org/drawingml/2006/wordprocessingDrawing" xmlns:w10="urn:schemas-microsoft-com:office:word" xmlns:w="http://schemas.openxmlformats.org/wordprocessingml/2006/main" xmlns:w14="http://schemas.microsoft.com/office/word/2010/wordml" xmlns:w15="http://schemas.microsoft.com/office/word/2012/wordml" xmlns:w16cex="http://schemas.microsoft.com/office/word/2018/wordml/cex" xmlns:w16cid="http://schemas.microsoft.com/office/word/2016/wordml/cid" xmlns:w16="http://schemas.microsoft.com/office/word/2018/wordml" xmlns:w16du="http://schemas.microsoft.com/office/word/2023/wordml/word16du" xmlns:w16sdtdh="http://schemas.microsoft.com/office/word/2020/wordml/sdtdatahash" xmlns:w16se="http://schemas.microsoft.com/office/word/2015/wordml/symex" xmlns:wpg="http://schemas.microsoft.com/office/word/2010/wordprocessingGroup" xmlns:wpi="http://schemas.microsoft.com/office/word/2010/wordprocessingInk" xmlns:wne="http://schemas.microsoft.com/office/word/2006/wordml" xmlns:wps="http://schemas.microsoft.com/office/word/2010/wordprocessingShape" mc:Ignorable="w14 w15 w16se w16cid w16 w16cex w16sdtdh w16du wp14">
+<w:endnotes xmlns:wpc="http://schemas.microsoft.com/office/word/2010/wordprocessingCanvas" xmlns:cx="http://schemas.microsoft.com/office/drawing/2014/chartex" xmlns:cx1="http://schemas.microsoft.com/office/drawing/2015/9/8/chartex" xmlns:cx2="http://schemas.microsoft.com/office/drawing/2015/10/21/chartex" xmlns:cx3="http://schemas.microsoft.com/office/drawing/2016/5/9/chartex" xmlns:cx4="http://schemas.microsoft.com/office/drawing/2016/5/10/chartex" xmlns:cx5="http://schemas.microsoft.com/office/drawing/2016/5/11/chartex" xmlns:cx6="http://schemas.microsoft.com/office/drawing/2016/5/12/chartex" xmlns:cx7="http://schemas.microsoft.com/office/drawing/2016/5/13/chartex" xmlns:cx8="http://schemas.microsoft.com/office/drawing/2016/5/14/chartex" xmlns:mc="http://schemas.openxmlformats.org/markup-compatibility/2006" xmlns:aink="http://schemas.microsoft.com/office/drawing/2016/ink" xmlns:am3d="http://schemas.microsoft.com/office/drawing/2017/model3d" xmlns:o="urn:schemas-microsoft-com:office:office" xmlns:r="http://schemas.openxmlformats.org/officeDocument/2006/relationships" xmlns:m="http://schemas.openxmlformats.org/officeDocument/2006/math" xmlns:v="urn:schemas-microsoft-com:vml" xmlns:wp14="http://schemas.microsoft.com/office/word/2010/wordprocessingDrawing" xmlns:wp="http://schemas.openxmlformats.org/drawingml/2006/wordprocessingDrawing" xmlns:w10="urn:schemas-microsoft-com:office:word" xmlns:w="http://schemas.openxmlformats.org/wordprocessingml/2006/main" xmlns:w14="http://schemas.microsoft.com/office/word/2010/wordml" xmlns:w15="http://schemas.microsoft.com/office/word/2012/wordml" xmlns:w16cex="http://schemas.microsoft.com/office/word/2018/wordml/cex" xmlns:w16cid="http://schemas.microsoft.com/office/word/2016/wordml/cid" xmlns:w16="http://schemas.microsoft.com/office/word/2018/wordml" xmlns:w16sdtdh="http://schemas.microsoft.com/office/word/2020/wordml/sdtdatahash" xmlns:w16se="http://schemas.microsoft.com/office/word/2015/wordml/symex" xmlns:wpg="http://schemas.microsoft.com/office/word/2010/wordprocessingGroup" xmlns:wpi="http://schemas.microsoft.com/office/word/2010/wordprocessingInk" xmlns:wne="http://schemas.microsoft.com/office/word/2006/wordml" xmlns:wps="http://schemas.microsoft.com/office/word/2010/wordprocessingShape" mc:Ignorable="w14 w15 w16se w16cid w16 w16cex w16sdtdh wp14">
   <w:endnote w:type="separator" w:id="-1">
     <w:p>
       <w:r>
@@ -1952,7 +1921,7 @@
 </file>
 
 <file path=word/footer1.xml><?xml version="1.0" encoding="utf-8"?>
-<w:ftr xmlns:wpc="http://schemas.microsoft.com/office/word/2010/wordprocessingCanvas" xmlns:cx="http://schemas.microsoft.com/office/drawing/2014/chartex" xmlns:cx1="http://schemas.microsoft.com/office/drawing/2015/9/8/chartex" xmlns:cx2="http://schemas.microsoft.com/office/drawing/2015/10/21/chartex" xmlns:cx3="http://schemas.microsoft.com/office/drawing/2016/5/9/chartex" xmlns:cx4="http://schemas.microsoft.com/office/drawing/2016/5/10/chartex" xmlns:cx5="http://schemas.microsoft.com/office/drawing/2016/5/11/chartex" xmlns:cx6="http://schemas.microsoft.com/office/drawing/2016/5/12/chartex" xmlns:cx7="http://schemas.microsoft.com/office/drawing/2016/5/13/chartex" xmlns:cx8="http://schemas.microsoft.com/office/drawing/2016/5/14/chartex" xmlns:mc="http://schemas.openxmlformats.org/markup-compatibility/2006" xmlns:aink="http://schemas.microsoft.com/office/drawing/2016/ink" xmlns:am3d="http://schemas.microsoft.com/office/drawing/2017/model3d" xmlns:o="urn:schemas-microsoft-com:office:office" xmlns:oel="http://schemas.microsoft.com/office/2019/extlst" xmlns:r="http://schemas.openxmlformats.org/officeDocument/2006/relationships" xmlns:m="http://schemas.openxmlformats.org/officeDocument/2006/math" xmlns:v="urn:schemas-microsoft-com:vml" xmlns:wp14="http://schemas.microsoft.com/office/word/2010/wordprocessingDrawing" xmlns:wp="http://schemas.openxmlformats.org/drawingml/2006/wordprocessingDrawing" xmlns:w10="urn:schemas-microsoft-com:office:word" xmlns:w="http://schemas.openxmlformats.org/wordprocessingml/2006/main" xmlns:w14="http://schemas.microsoft.com/office/word/2010/wordml" xmlns:w15="http://schemas.microsoft.com/office/word/2012/wordml" xmlns:w16cex="http://schemas.microsoft.com/office/word/2018/wordml/cex" xmlns:w16cid="http://schemas.microsoft.com/office/word/2016/wordml/cid" xmlns:w16="http://schemas.microsoft.com/office/word/2018/wordml" xmlns:w16du="http://schemas.microsoft.com/office/word/2023/wordml/word16du" xmlns:w16sdtdh="http://schemas.microsoft.com/office/word/2020/wordml/sdtdatahash" xmlns:w16se="http://schemas.microsoft.com/office/word/2015/wordml/symex" xmlns:wpg="http://schemas.microsoft.com/office/word/2010/wordprocessingGroup" xmlns:wpi="http://schemas.microsoft.com/office/word/2010/wordprocessingInk" xmlns:wne="http://schemas.microsoft.com/office/word/2006/wordml" xmlns:wps="http://schemas.microsoft.com/office/word/2010/wordprocessingShape" mc:Ignorable="w14 w15 w16se w16cid w16 w16cex w16sdtdh w16du wp14">
+<w:ftr xmlns:wpc="http://schemas.microsoft.com/office/word/2010/wordprocessingCanvas" xmlns:cx="http://schemas.microsoft.com/office/drawing/2014/chartex" xmlns:cx1="http://schemas.microsoft.com/office/drawing/2015/9/8/chartex" xmlns:cx2="http://schemas.microsoft.com/office/drawing/2015/10/21/chartex" xmlns:cx3="http://schemas.microsoft.com/office/drawing/2016/5/9/chartex" xmlns:cx4="http://schemas.microsoft.com/office/drawing/2016/5/10/chartex" xmlns:cx5="http://schemas.microsoft.com/office/drawing/2016/5/11/chartex" xmlns:cx6="http://schemas.microsoft.com/office/drawing/2016/5/12/chartex" xmlns:cx7="http://schemas.microsoft.com/office/drawing/2016/5/13/chartex" xmlns:cx8="http://schemas.microsoft.com/office/drawing/2016/5/14/chartex" xmlns:mc="http://schemas.openxmlformats.org/markup-compatibility/2006" xmlns:aink="http://schemas.microsoft.com/office/drawing/2016/ink" xmlns:am3d="http://schemas.microsoft.com/office/drawing/2017/model3d" xmlns:o="urn:schemas-microsoft-com:office:office" xmlns:r="http://schemas.openxmlformats.org/officeDocument/2006/relationships" xmlns:m="http://schemas.openxmlformats.org/officeDocument/2006/math" xmlns:v="urn:schemas-microsoft-com:vml" xmlns:wp14="http://schemas.microsoft.com/office/word/2010/wordprocessingDrawing" xmlns:wp="http://schemas.openxmlformats.org/drawingml/2006/wordprocessingDrawing" xmlns:w10="urn:schemas-microsoft-com:office:word" xmlns:w="http://schemas.openxmlformats.org/wordprocessingml/2006/main" xmlns:w14="http://schemas.microsoft.com/office/word/2010/wordml" xmlns:w15="http://schemas.microsoft.com/office/word/2012/wordml" xmlns:w16cex="http://schemas.microsoft.com/office/word/2018/wordml/cex" xmlns:w16cid="http://schemas.microsoft.com/office/word/2016/wordml/cid" xmlns:w16="http://schemas.microsoft.com/office/word/2018/wordml" xmlns:w16sdtdh="http://schemas.microsoft.com/office/word/2020/wordml/sdtdatahash" xmlns:w16se="http://schemas.microsoft.com/office/word/2015/wordml/symex" xmlns:wpg="http://schemas.microsoft.com/office/word/2010/wordprocessingGroup" xmlns:wpi="http://schemas.microsoft.com/office/word/2010/wordprocessingInk" xmlns:wne="http://schemas.microsoft.com/office/word/2006/wordml" xmlns:wps="http://schemas.microsoft.com/office/word/2010/wordprocessingShape" mc:Ignorable="w14 w15 w16se w16cid w16 w16cex w16sdtdh wp14">
   <w:p>
     <w:pPr>
       <w:pStyle w:val="Piedepgina"/>
@@ -1990,7 +1959,7 @@
 </file>
 
 <file path=word/footer2.xml><?xml version="1.0" encoding="utf-8"?>
-<w:ftr xmlns:wpc="http://schemas.microsoft.com/office/word/2010/wordprocessingCanvas" xmlns:cx="http://schemas.microsoft.com/office/drawing/2014/chartex" xmlns:cx1="http://schemas.microsoft.com/office/drawing/2015/9/8/chartex" xmlns:cx2="http://schemas.microsoft.com/office/drawing/2015/10/21/chartex" xmlns:cx3="http://schemas.microsoft.com/office/drawing/2016/5/9/chartex" xmlns:cx4="http://schemas.microsoft.com/office/drawing/2016/5/10/chartex" xmlns:cx5="http://schemas.microsoft.com/office/drawing/2016/5/11/chartex" xmlns:cx6="http://schemas.microsoft.com/office/drawing/2016/5/12/chartex" xmlns:cx7="http://schemas.microsoft.com/office/drawing/2016/5/13/chartex" xmlns:cx8="http://schemas.microsoft.com/office/drawing/2016/5/14/chartex" xmlns:mc="http://schemas.openxmlformats.org/markup-compatibility/2006" xmlns:aink="http://schemas.microsoft.com/office/drawing/2016/ink" xmlns:am3d="http://schemas.microsoft.com/office/drawing/2017/model3d" xmlns:o="urn:schemas-microsoft-com:office:office" xmlns:oel="http://schemas.microsoft.com/office/2019/extlst" xmlns:r="http://schemas.openxmlformats.org/officeDocument/2006/relationships" xmlns:m="http://schemas.openxmlformats.org/officeDocument/2006/math" xmlns:v="urn:schemas-microsoft-com:vml" xmlns:wp14="http://schemas.microsoft.com/office/word/2010/wordprocessingDrawing" xmlns:wp="http://schemas.openxmlformats.org/drawingml/2006/wordprocessingDrawing" xmlns:w10="urn:schemas-microsoft-com:office:word" xmlns:w="http://schemas.openxmlformats.org/wordprocessingml/2006/main" xmlns:w14="http://schemas.microsoft.com/office/word/2010/wordml" xmlns:w15="http://schemas.microsoft.com/office/word/2012/wordml" xmlns:w16cex="http://schemas.microsoft.com/office/word/2018/wordml/cex" xmlns:w16cid="http://schemas.microsoft.com/office/word/2016/wordml/cid" xmlns:w16="http://schemas.microsoft.com/office/word/2018/wordml" xmlns:w16du="http://schemas.microsoft.com/office/word/2023/wordml/word16du" xmlns:w16sdtdh="http://schemas.microsoft.com/office/word/2020/wordml/sdtdatahash" xmlns:w16se="http://schemas.microsoft.com/office/word/2015/wordml/symex" xmlns:wpg="http://schemas.microsoft.com/office/word/2010/wordprocessingGroup" xmlns:wpi="http://schemas.microsoft.com/office/word/2010/wordprocessingInk" xmlns:wne="http://schemas.microsoft.com/office/word/2006/wordml" xmlns:wps="http://schemas.microsoft.com/office/word/2010/wordprocessingShape" mc:Ignorable="w14 w15 w16se w16cid w16 w16cex w16sdtdh w16du wp14">
+<w:ftr xmlns:wpc="http://schemas.microsoft.com/office/word/2010/wordprocessingCanvas" xmlns:cx="http://schemas.microsoft.com/office/drawing/2014/chartex" xmlns:cx1="http://schemas.microsoft.com/office/drawing/2015/9/8/chartex" xmlns:cx2="http://schemas.microsoft.com/office/drawing/2015/10/21/chartex" xmlns:cx3="http://schemas.microsoft.com/office/drawing/2016/5/9/chartex" xmlns:cx4="http://schemas.microsoft.com/office/drawing/2016/5/10/chartex" xmlns:cx5="http://schemas.microsoft.com/office/drawing/2016/5/11/chartex" xmlns:cx6="http://schemas.microsoft.com/office/drawing/2016/5/12/chartex" xmlns:cx7="http://schemas.microsoft.com/office/drawing/2016/5/13/chartex" xmlns:cx8="http://schemas.microsoft.com/office/drawing/2016/5/14/chartex" xmlns:mc="http://schemas.openxmlformats.org/markup-compatibility/2006" xmlns:aink="http://schemas.microsoft.com/office/drawing/2016/ink" xmlns:am3d="http://schemas.microsoft.com/office/drawing/2017/model3d" xmlns:o="urn:schemas-microsoft-com:office:office" xmlns:r="http://schemas.openxmlformats.org/officeDocument/2006/relationships" xmlns:m="http://schemas.openxmlformats.org/officeDocument/2006/math" xmlns:v="urn:schemas-microsoft-com:vml" xmlns:wp14="http://schemas.microsoft.com/office/word/2010/wordprocessingDrawing" xmlns:wp="http://schemas.openxmlformats.org/drawingml/2006/wordprocessingDrawing" xmlns:w10="urn:schemas-microsoft-com:office:word" xmlns:w="http://schemas.openxmlformats.org/wordprocessingml/2006/main" xmlns:w14="http://schemas.microsoft.com/office/word/2010/wordml" xmlns:w15="http://schemas.microsoft.com/office/word/2012/wordml" xmlns:w16cex="http://schemas.microsoft.com/office/word/2018/wordml/cex" xmlns:w16cid="http://schemas.microsoft.com/office/word/2016/wordml/cid" xmlns:w16="http://schemas.microsoft.com/office/word/2018/wordml" xmlns:w16sdtdh="http://schemas.microsoft.com/office/word/2020/wordml/sdtdatahash" xmlns:w16se="http://schemas.microsoft.com/office/word/2015/wordml/symex" xmlns:wpg="http://schemas.microsoft.com/office/word/2010/wordprocessingGroup" xmlns:wpi="http://schemas.microsoft.com/office/word/2010/wordprocessingInk" xmlns:wne="http://schemas.microsoft.com/office/word/2006/wordml" xmlns:wps="http://schemas.microsoft.com/office/word/2010/wordprocessingShape" mc:Ignorable="w14 w15 w16se w16cid w16 w16cex w16sdtdh wp14">
   <w:p>
     <w:pPr>
       <w:pStyle w:val="Piedepgina"/>
@@ -2029,7 +1998,6 @@
         <w:sz w:val="12"/>
       </w:rPr>
     </w:pPr>
-    <w:proofErr w:type="gramStart"/>
     <w:r>
       <w:rPr>
         <w:rFonts w:ascii="Arial" w:hAnsi="Arial" w:cs="Arial"/>
@@ -2037,17 +2005,7 @@
         <w:bCs/>
         <w:sz w:val="12"/>
       </w:rPr>
-      <w:t>SUB GERENCIA</w:t>
-    </w:r>
-    <w:proofErr w:type="gramEnd"/>
-    <w:r>
-      <w:rPr>
-        <w:rFonts w:ascii="Arial" w:hAnsi="Arial" w:cs="Arial"/>
-        <w:b/>
-        <w:bCs/>
-        <w:sz w:val="12"/>
-      </w:rPr>
-      <w:t xml:space="preserve"> DE DEPURACIÓN DE REGISTROS CIVILES</w:t>
+      <w:t>SUB GERENCIA DE DEPURACIÓN DE REGISTROS CIVILES</w:t>
     </w:r>
   </w:p>
   <w:p>
@@ -2133,7 +2091,7 @@
 </file>
 
 <file path=word/footnotes.xml><?xml version="1.0" encoding="utf-8"?>
-<w:footnotes xmlns:wpc="http://schemas.microsoft.com/office/word/2010/wordprocessingCanvas" xmlns:cx="http://schemas.microsoft.com/office/drawing/2014/chartex" xmlns:cx1="http://schemas.microsoft.com/office/drawing/2015/9/8/chartex" xmlns:cx2="http://schemas.microsoft.com/office/drawing/2015/10/21/chartex" xmlns:cx3="http://schemas.microsoft.com/office/drawing/2016/5/9/chartex" xmlns:cx4="http://schemas.microsoft.com/office/drawing/2016/5/10/chartex" xmlns:cx5="http://schemas.microsoft.com/office/drawing/2016/5/11/chartex" xmlns:cx6="http://schemas.microsoft.com/office/drawing/2016/5/12/chartex" xmlns:cx7="http://schemas.microsoft.com/office/drawing/2016/5/13/chartex" xmlns:cx8="http://schemas.microsoft.com/office/drawing/2016/5/14/chartex" xmlns:mc="http://schemas.openxmlformats.org/markup-compatibility/2006" xmlns:aink="http://schemas.microsoft.com/office/drawing/2016/ink" xmlns:am3d="http://schemas.microsoft.com/office/drawing/2017/model3d" xmlns:o="urn:schemas-microsoft-com:office:office" xmlns:oel="http://schemas.microsoft.com/office/2019/extlst" xmlns:r="http://schemas.openxmlformats.org/officeDocument/2006/relationships" xmlns:m="http://schemas.openxmlformats.org/officeDocument/2006/math" xmlns:v="urn:schemas-microsoft-com:vml" xmlns:wp14="http://schemas.microsoft.com/office/word/2010/wordprocessingDrawing" xmlns:wp="http://schemas.openxmlformats.org/drawingml/2006/wordprocessingDrawing" xmlns:w10="urn:schemas-microsoft-com:office:word" xmlns:w="http://schemas.openxmlformats.org/wordprocessingml/2006/main" xmlns:w14="http://schemas.microsoft.com/office/word/2010/wordml" xmlns:w15="http://schemas.microsoft.com/office/word/2012/wordml" xmlns:w16cex="http://schemas.microsoft.com/office/word/2018/wordml/cex" xmlns:w16cid="http://schemas.microsoft.com/office/word/2016/wordml/cid" xmlns:w16="http://schemas.microsoft.com/office/word/2018/wordml" xmlns:w16du="http://schemas.microsoft.com/office/word/2023/wordml/word16du" xmlns:w16sdtdh="http://schemas.microsoft.com/office/word/2020/wordml/sdtdatahash" xmlns:w16se="http://schemas.microsoft.com/office/word/2015/wordml/symex" xmlns:wpg="http://schemas.microsoft.com/office/word/2010/wordprocessingGroup" xmlns:wpi="http://schemas.microsoft.com/office/word/2010/wordprocessingInk" xmlns:wne="http://schemas.microsoft.com/office/word/2006/wordml" xmlns:wps="http://schemas.microsoft.com/office/word/2010/wordprocessingShape" mc:Ignorable="w14 w15 w16se w16cid w16 w16cex w16sdtdh w16du wp14">
+<w:footnotes xmlns:wpc="http://schemas.microsoft.com/office/word/2010/wordprocessingCanvas" xmlns:cx="http://schemas.microsoft.com/office/drawing/2014/chartex" xmlns:cx1="http://schemas.microsoft.com/office/drawing/2015/9/8/chartex" xmlns:cx2="http://schemas.microsoft.com/office/drawing/2015/10/21/chartex" xmlns:cx3="http://schemas.microsoft.com/office/drawing/2016/5/9/chartex" xmlns:cx4="http://schemas.microsoft.com/office/drawing/2016/5/10/chartex" xmlns:cx5="http://schemas.microsoft.com/office/drawing/2016/5/11/chartex" xmlns:cx6="http://schemas.microsoft.com/office/drawing/2016/5/12/chartex" xmlns:cx7="http://schemas.microsoft.com/office/drawing/2016/5/13/chartex" xmlns:cx8="http://schemas.microsoft.com/office/drawing/2016/5/14/chartex" xmlns:mc="http://schemas.openxmlformats.org/markup-compatibility/2006" xmlns:aink="http://schemas.microsoft.com/office/drawing/2016/ink" xmlns:am3d="http://schemas.microsoft.com/office/drawing/2017/model3d" xmlns:o="urn:schemas-microsoft-com:office:office" xmlns:r="http://schemas.openxmlformats.org/officeDocument/2006/relationships" xmlns:m="http://schemas.openxmlformats.org/officeDocument/2006/math" xmlns:v="urn:schemas-microsoft-com:vml" xmlns:wp14="http://schemas.microsoft.com/office/word/2010/wordprocessingDrawing" xmlns:wp="http://schemas.openxmlformats.org/drawingml/2006/wordprocessingDrawing" xmlns:w10="urn:schemas-microsoft-com:office:word" xmlns:w="http://schemas.openxmlformats.org/wordprocessingml/2006/main" xmlns:w14="http://schemas.microsoft.com/office/word/2010/wordml" xmlns:w15="http://schemas.microsoft.com/office/word/2012/wordml" xmlns:w16cex="http://schemas.microsoft.com/office/word/2018/wordml/cex" xmlns:w16cid="http://schemas.microsoft.com/office/word/2016/wordml/cid" xmlns:w16="http://schemas.microsoft.com/office/word/2018/wordml" xmlns:w16sdtdh="http://schemas.microsoft.com/office/word/2020/wordml/sdtdatahash" xmlns:w16se="http://schemas.microsoft.com/office/word/2015/wordml/symex" xmlns:wpg="http://schemas.microsoft.com/office/word/2010/wordprocessingGroup" xmlns:wpi="http://schemas.microsoft.com/office/word/2010/wordprocessingInk" xmlns:wne="http://schemas.microsoft.com/office/word/2006/wordml" xmlns:wps="http://schemas.microsoft.com/office/word/2010/wordprocessingShape" mc:Ignorable="w14 w15 w16se w16cid w16 w16cex w16sdtdh wp14">
   <w:footnote w:type="separator" w:id="-1">
     <w:p>
       <w:r>
@@ -2152,7 +2110,7 @@
 </file>
 
 <file path=word/header1.xml><?xml version="1.0" encoding="utf-8"?>
-<w:hdr xmlns:wpc="http://schemas.microsoft.com/office/word/2010/wordprocessingCanvas" xmlns:cx="http://schemas.microsoft.com/office/drawing/2014/chartex" xmlns:cx1="http://schemas.microsoft.com/office/drawing/2015/9/8/chartex" xmlns:cx2="http://schemas.microsoft.com/office/drawing/2015/10/21/chartex" xmlns:cx3="http://schemas.microsoft.com/office/drawing/2016/5/9/chartex" xmlns:cx4="http://schemas.microsoft.com/office/drawing/2016/5/10/chartex" xmlns:cx5="http://schemas.microsoft.com/office/drawing/2016/5/11/chartex" xmlns:cx6="http://schemas.microsoft.com/office/drawing/2016/5/12/chartex" xmlns:cx7="http://schemas.microsoft.com/office/drawing/2016/5/13/chartex" xmlns:cx8="http://schemas.microsoft.com/office/drawing/2016/5/14/chartex" xmlns:mc="http://schemas.openxmlformats.org/markup-compatibility/2006" xmlns:aink="http://schemas.microsoft.com/office/drawing/2016/ink" xmlns:am3d="http://schemas.microsoft.com/office/drawing/2017/model3d" xmlns:o="urn:schemas-microsoft-com:office:office" xmlns:oel="http://schemas.microsoft.com/office/2019/extlst" xmlns:r="http://schemas.openxmlformats.org/officeDocument/2006/relationships" xmlns:m="http://schemas.openxmlformats.org/officeDocument/2006/math" xmlns:v="urn:schemas-microsoft-com:vml" xmlns:wp14="http://schemas.microsoft.com/office/word/2010/wordprocessingDrawing" xmlns:wp="http://schemas.openxmlformats.org/drawingml/2006/wordprocessingDrawing" xmlns:w10="urn:schemas-microsoft-com:office:word" xmlns:w="http://schemas.openxmlformats.org/wordprocessingml/2006/main" xmlns:w14="http://schemas.microsoft.com/office/word/2010/wordml" xmlns:w15="http://schemas.microsoft.com/office/word/2012/wordml" xmlns:w16cex="http://schemas.microsoft.com/office/word/2018/wordml/cex" xmlns:w16cid="http://schemas.microsoft.com/office/word/2016/wordml/cid" xmlns:w16="http://schemas.microsoft.com/office/word/2018/wordml" xmlns:w16du="http://schemas.microsoft.com/office/word/2023/wordml/word16du" xmlns:w16sdtdh="http://schemas.microsoft.com/office/word/2020/wordml/sdtdatahash" xmlns:w16se="http://schemas.microsoft.com/office/word/2015/wordml/symex" xmlns:wpg="http://schemas.microsoft.com/office/word/2010/wordprocessingGroup" xmlns:wpi="http://schemas.microsoft.com/office/word/2010/wordprocessingInk" xmlns:wne="http://schemas.microsoft.com/office/word/2006/wordml" xmlns:wps="http://schemas.microsoft.com/office/word/2010/wordprocessingShape" mc:Ignorable="w14 w15 w16se w16cid w16 w16cex w16sdtdh w16du wp14">
+<w:hdr xmlns:wpc="http://schemas.microsoft.com/office/word/2010/wordprocessingCanvas" xmlns:cx="http://schemas.microsoft.com/office/drawing/2014/chartex" xmlns:cx1="http://schemas.microsoft.com/office/drawing/2015/9/8/chartex" xmlns:cx2="http://schemas.microsoft.com/office/drawing/2015/10/21/chartex" xmlns:cx3="http://schemas.microsoft.com/office/drawing/2016/5/9/chartex" xmlns:cx4="http://schemas.microsoft.com/office/drawing/2016/5/10/chartex" xmlns:cx5="http://schemas.microsoft.com/office/drawing/2016/5/11/chartex" xmlns:cx6="http://schemas.microsoft.com/office/drawing/2016/5/12/chartex" xmlns:cx7="http://schemas.microsoft.com/office/drawing/2016/5/13/chartex" xmlns:cx8="http://schemas.microsoft.com/office/drawing/2016/5/14/chartex" xmlns:mc="http://schemas.openxmlformats.org/markup-compatibility/2006" xmlns:aink="http://schemas.microsoft.com/office/drawing/2016/ink" xmlns:am3d="http://schemas.microsoft.com/office/drawing/2017/model3d" xmlns:o="urn:schemas-microsoft-com:office:office" xmlns:r="http://schemas.openxmlformats.org/officeDocument/2006/relationships" xmlns:m="http://schemas.openxmlformats.org/officeDocument/2006/math" xmlns:v="urn:schemas-microsoft-com:vml" xmlns:wp14="http://schemas.microsoft.com/office/word/2010/wordprocessingDrawing" xmlns:wp="http://schemas.openxmlformats.org/drawingml/2006/wordprocessingDrawing" xmlns:w10="urn:schemas-microsoft-com:office:word" xmlns:w="http://schemas.openxmlformats.org/wordprocessingml/2006/main" xmlns:w14="http://schemas.microsoft.com/office/word/2010/wordml" xmlns:w15="http://schemas.microsoft.com/office/word/2012/wordml" xmlns:w16cex="http://schemas.microsoft.com/office/word/2018/wordml/cex" xmlns:w16cid="http://schemas.microsoft.com/office/word/2016/wordml/cid" xmlns:w16="http://schemas.microsoft.com/office/word/2018/wordml" xmlns:w16sdtdh="http://schemas.microsoft.com/office/word/2020/wordml/sdtdatahash" xmlns:w16se="http://schemas.microsoft.com/office/word/2015/wordml/symex" xmlns:wpg="http://schemas.microsoft.com/office/word/2010/wordprocessingGroup" xmlns:wpi="http://schemas.microsoft.com/office/word/2010/wordprocessingInk" xmlns:wne="http://schemas.microsoft.com/office/word/2006/wordml" xmlns:wps="http://schemas.microsoft.com/office/word/2010/wordprocessingShape" mc:Ignorable="w14 w15 w16se w16cid w16 w16cex w16sdtdh wp14">
   <w:p>
     <w:pPr>
       <w:pStyle w:val="Encabezado"/>
@@ -2219,7 +2177,7 @@
 </file>
 
 <file path=word/header2.xml><?xml version="1.0" encoding="utf-8"?>
-<w:hdr xmlns:wpc="http://schemas.microsoft.com/office/word/2010/wordprocessingCanvas" xmlns:cx="http://schemas.microsoft.com/office/drawing/2014/chartex" xmlns:cx1="http://schemas.microsoft.com/office/drawing/2015/9/8/chartex" xmlns:cx2="http://schemas.microsoft.com/office/drawing/2015/10/21/chartex" xmlns:cx3="http://schemas.microsoft.com/office/drawing/2016/5/9/chartex" xmlns:cx4="http://schemas.microsoft.com/office/drawing/2016/5/10/chartex" xmlns:cx5="http://schemas.microsoft.com/office/drawing/2016/5/11/chartex" xmlns:cx6="http://schemas.microsoft.com/office/drawing/2016/5/12/chartex" xmlns:cx7="http://schemas.microsoft.com/office/drawing/2016/5/13/chartex" xmlns:cx8="http://schemas.microsoft.com/office/drawing/2016/5/14/chartex" xmlns:mc="http://schemas.openxmlformats.org/markup-compatibility/2006" xmlns:aink="http://schemas.microsoft.com/office/drawing/2016/ink" xmlns:am3d="http://schemas.microsoft.com/office/drawing/2017/model3d" xmlns:o="urn:schemas-microsoft-com:office:office" xmlns:oel="http://schemas.microsoft.com/office/2019/extlst" xmlns:r="http://schemas.openxmlformats.org/officeDocument/2006/relationships" xmlns:m="http://schemas.openxmlformats.org/officeDocument/2006/math" xmlns:v="urn:schemas-microsoft-com:vml" xmlns:wp14="http://schemas.microsoft.com/office/word/2010/wordprocessingDrawing" xmlns:wp="http://schemas.openxmlformats.org/drawingml/2006/wordprocessingDrawing" xmlns:w10="urn:schemas-microsoft-com:office:word" xmlns:w="http://schemas.openxmlformats.org/wordprocessingml/2006/main" xmlns:w14="http://schemas.microsoft.com/office/word/2010/wordml" xmlns:w15="http://schemas.microsoft.com/office/word/2012/wordml" xmlns:w16cex="http://schemas.microsoft.com/office/word/2018/wordml/cex" xmlns:w16cid="http://schemas.microsoft.com/office/word/2016/wordml/cid" xmlns:w16="http://schemas.microsoft.com/office/word/2018/wordml" xmlns:w16du="http://schemas.microsoft.com/office/word/2023/wordml/word16du" xmlns:w16sdtdh="http://schemas.microsoft.com/office/word/2020/wordml/sdtdatahash" xmlns:w16se="http://schemas.microsoft.com/office/word/2015/wordml/symex" xmlns:wpg="http://schemas.microsoft.com/office/word/2010/wordprocessingGroup" xmlns:wpi="http://schemas.microsoft.com/office/word/2010/wordprocessingInk" xmlns:wne="http://schemas.microsoft.com/office/word/2006/wordml" xmlns:wps="http://schemas.microsoft.com/office/word/2010/wordprocessingShape" mc:Ignorable="w14 w15 w16se w16cid w16 w16cex w16sdtdh w16du wp14">
+<w:hdr xmlns:wpc="http://schemas.microsoft.com/office/word/2010/wordprocessingCanvas" xmlns:cx="http://schemas.microsoft.com/office/drawing/2014/chartex" xmlns:cx1="http://schemas.microsoft.com/office/drawing/2015/9/8/chartex" xmlns:cx2="http://schemas.microsoft.com/office/drawing/2015/10/21/chartex" xmlns:cx3="http://schemas.microsoft.com/office/drawing/2016/5/9/chartex" xmlns:cx4="http://schemas.microsoft.com/office/drawing/2016/5/10/chartex" xmlns:cx5="http://schemas.microsoft.com/office/drawing/2016/5/11/chartex" xmlns:cx6="http://schemas.microsoft.com/office/drawing/2016/5/12/chartex" xmlns:cx7="http://schemas.microsoft.com/office/drawing/2016/5/13/chartex" xmlns:cx8="http://schemas.microsoft.com/office/drawing/2016/5/14/chartex" xmlns:mc="http://schemas.openxmlformats.org/markup-compatibility/2006" xmlns:aink="http://schemas.microsoft.com/office/drawing/2016/ink" xmlns:am3d="http://schemas.microsoft.com/office/drawing/2017/model3d" xmlns:o="urn:schemas-microsoft-com:office:office" xmlns:r="http://schemas.openxmlformats.org/officeDocument/2006/relationships" xmlns:m="http://schemas.openxmlformats.org/officeDocument/2006/math" xmlns:v="urn:schemas-microsoft-com:vml" xmlns:wp14="http://schemas.microsoft.com/office/word/2010/wordprocessingDrawing" xmlns:wp="http://schemas.openxmlformats.org/drawingml/2006/wordprocessingDrawing" xmlns:w10="urn:schemas-microsoft-com:office:word" xmlns:w="http://schemas.openxmlformats.org/wordprocessingml/2006/main" xmlns:w14="http://schemas.microsoft.com/office/word/2010/wordml" xmlns:w15="http://schemas.microsoft.com/office/word/2012/wordml" xmlns:w16cex="http://schemas.microsoft.com/office/word/2018/wordml/cex" xmlns:w16cid="http://schemas.microsoft.com/office/word/2016/wordml/cid" xmlns:w16="http://schemas.microsoft.com/office/word/2018/wordml" xmlns:w16sdtdh="http://schemas.microsoft.com/office/word/2020/wordml/sdtdatahash" xmlns:w16se="http://schemas.microsoft.com/office/word/2015/wordml/symex" xmlns:wpg="http://schemas.microsoft.com/office/word/2010/wordprocessingGroup" xmlns:wpi="http://schemas.microsoft.com/office/word/2010/wordprocessingInk" xmlns:wne="http://schemas.microsoft.com/office/word/2006/wordml" xmlns:wps="http://schemas.microsoft.com/office/word/2010/wordprocessingShape" mc:Ignorable="w14 w15 w16se w16cid w16 w16cex w16sdtdh wp14">
   <w:p>
     <w:pPr>
       <w:pStyle w:val="Encabezado"/>
@@ -2286,7 +2244,7 @@
 </file>
 
 <file path=word/numbering.xml><?xml version="1.0" encoding="utf-8"?>
-<w:numbering xmlns:wpc="http://schemas.microsoft.com/office/word/2010/wordprocessingCanvas" xmlns:cx="http://schemas.microsoft.com/office/drawing/2014/chartex" xmlns:cx1="http://schemas.microsoft.com/office/drawing/2015/9/8/chartex" xmlns:cx2="http://schemas.microsoft.com/office/drawing/2015/10/21/chartex" xmlns:cx3="http://schemas.microsoft.com/office/drawing/2016/5/9/chartex" xmlns:cx4="http://schemas.microsoft.com/office/drawing/2016/5/10/chartex" xmlns:cx5="http://schemas.microsoft.com/office/drawing/2016/5/11/chartex" xmlns:cx6="http://schemas.microsoft.com/office/drawing/2016/5/12/chartex" xmlns:cx7="http://schemas.microsoft.com/office/drawing/2016/5/13/chartex" xmlns:cx8="http://schemas.microsoft.com/office/drawing/2016/5/14/chartex" xmlns:mc="http://schemas.openxmlformats.org/markup-compatibility/2006" xmlns:aink="http://schemas.microsoft.com/office/drawing/2016/ink" xmlns:am3d="http://schemas.microsoft.com/office/drawing/2017/model3d" xmlns:o="urn:schemas-microsoft-com:office:office" xmlns:oel="http://schemas.microsoft.com/office/2019/extlst" xmlns:r="http://schemas.openxmlformats.org/officeDocument/2006/relationships" xmlns:m="http://schemas.openxmlformats.org/officeDocument/2006/math" xmlns:v="urn:schemas-microsoft-com:vml" xmlns:wp14="http://schemas.microsoft.com/office/word/2010/wordprocessingDrawing" xmlns:wp="http://schemas.openxmlformats.org/drawingml/2006/wordprocessingDrawing" xmlns:w10="urn:schemas-microsoft-com:office:word" xmlns:w="http://schemas.openxmlformats.org/wordprocessingml/2006/main" xmlns:w14="http://schemas.microsoft.com/office/word/2010/wordml" xmlns:w15="http://schemas.microsoft.com/office/word/2012/wordml" xmlns:w16cex="http://schemas.microsoft.com/office/word/2018/wordml/cex" xmlns:w16cid="http://schemas.microsoft.com/office/word/2016/wordml/cid" xmlns:w16="http://schemas.microsoft.com/office/word/2018/wordml" xmlns:w16du="http://schemas.microsoft.com/office/word/2023/wordml/word16du" xmlns:w16sdtdh="http://schemas.microsoft.com/office/word/2020/wordml/sdtdatahash" xmlns:w16se="http://schemas.microsoft.com/office/word/2015/wordml/symex" xmlns:wpg="http://schemas.microsoft.com/office/word/2010/wordprocessingGroup" xmlns:wpi="http://schemas.microsoft.com/office/word/2010/wordprocessingInk" xmlns:wne="http://schemas.microsoft.com/office/word/2006/wordml" xmlns:wps="http://schemas.microsoft.com/office/word/2010/wordprocessingShape" mc:Ignorable="w14 w15 w16se w16cid w16 w16cex w16sdtdh w16du wp14">
+<w:numbering xmlns:wpc="http://schemas.microsoft.com/office/word/2010/wordprocessingCanvas" xmlns:cx="http://schemas.microsoft.com/office/drawing/2014/chartex" xmlns:cx1="http://schemas.microsoft.com/office/drawing/2015/9/8/chartex" xmlns:cx2="http://schemas.microsoft.com/office/drawing/2015/10/21/chartex" xmlns:cx3="http://schemas.microsoft.com/office/drawing/2016/5/9/chartex" xmlns:cx4="http://schemas.microsoft.com/office/drawing/2016/5/10/chartex" xmlns:cx5="http://schemas.microsoft.com/office/drawing/2016/5/11/chartex" xmlns:cx6="http://schemas.microsoft.com/office/drawing/2016/5/12/chartex" xmlns:cx7="http://schemas.microsoft.com/office/drawing/2016/5/13/chartex" xmlns:cx8="http://schemas.microsoft.com/office/drawing/2016/5/14/chartex" xmlns:mc="http://schemas.openxmlformats.org/markup-compatibility/2006" xmlns:aink="http://schemas.microsoft.com/office/drawing/2016/ink" xmlns:am3d="http://schemas.microsoft.com/office/drawing/2017/model3d" xmlns:o="urn:schemas-microsoft-com:office:office" xmlns:r="http://schemas.openxmlformats.org/officeDocument/2006/relationships" xmlns:m="http://schemas.openxmlformats.org/officeDocument/2006/math" xmlns:v="urn:schemas-microsoft-com:vml" xmlns:wp14="http://schemas.microsoft.com/office/word/2010/wordprocessingDrawing" xmlns:wp="http://schemas.openxmlformats.org/drawingml/2006/wordprocessingDrawing" xmlns:w10="urn:schemas-microsoft-com:office:word" xmlns:w="http://schemas.openxmlformats.org/wordprocessingml/2006/main" xmlns:w14="http://schemas.microsoft.com/office/word/2010/wordml" xmlns:w15="http://schemas.microsoft.com/office/word/2012/wordml" xmlns:w16cex="http://schemas.microsoft.com/office/word/2018/wordml/cex" xmlns:w16cid="http://schemas.microsoft.com/office/word/2016/wordml/cid" xmlns:w16="http://schemas.microsoft.com/office/word/2018/wordml" xmlns:w16sdtdh="http://schemas.microsoft.com/office/word/2020/wordml/sdtdatahash" xmlns:w16se="http://schemas.microsoft.com/office/word/2015/wordml/symex" xmlns:wpg="http://schemas.microsoft.com/office/word/2010/wordprocessingGroup" xmlns:wpi="http://schemas.microsoft.com/office/word/2010/wordprocessingInk" xmlns:wne="http://schemas.microsoft.com/office/word/2006/wordml" xmlns:wps="http://schemas.microsoft.com/office/word/2010/wordprocessingShape" mc:Ignorable="w14 w15 w16se w16cid w16 w16cex w16sdtdh wp14">
   <w:abstractNum w:abstractNumId="0" w15:restartNumberingAfterBreak="0">
     <w:nsid w:val="27732442"/>
     <w:multiLevelType w:val="multilevel"/>
@@ -2626,20 +2584,20 @@
       </w:rPr>
     </w:lvl>
   </w:abstractNum>
-  <w:num w:numId="1" w16cid:durableId="1696955473">
+  <w:num w:numId="1">
     <w:abstractNumId w:val="0"/>
   </w:num>
-  <w:num w:numId="2" w16cid:durableId="460459124">
+  <w:num w:numId="2">
     <w:abstractNumId w:val="2"/>
   </w:num>
-  <w:num w:numId="3" w16cid:durableId="1978798448">
+  <w:num w:numId="3">
     <w:abstractNumId w:val="1"/>
   </w:num>
 </w:numbering>
 </file>
 
 <file path=word/styles.xml><?xml version="1.0" encoding="utf-8"?>
-<w:styles xmlns:mc="http://schemas.openxmlformats.org/markup-compatibility/2006" xmlns:r="http://schemas.openxmlformats.org/officeDocument/2006/relationships" xmlns:w="http://schemas.openxmlformats.org/wordprocessingml/2006/main" xmlns:w14="http://schemas.microsoft.com/office/word/2010/wordml" xmlns:w15="http://schemas.microsoft.com/office/word/2012/wordml" xmlns:w16cex="http://schemas.microsoft.com/office/word/2018/wordml/cex" xmlns:w16cid="http://schemas.microsoft.com/office/word/2016/wordml/cid" xmlns:w16="http://schemas.microsoft.com/office/word/2018/wordml" xmlns:w16du="http://schemas.microsoft.com/office/word/2023/wordml/word16du" xmlns:w16sdtdh="http://schemas.microsoft.com/office/word/2020/wordml/sdtdatahash" xmlns:w16se="http://schemas.microsoft.com/office/word/2015/wordml/symex" mc:Ignorable="w14 w15 w16se w16cid w16 w16cex w16sdtdh w16du">
+<w:styles xmlns:mc="http://schemas.openxmlformats.org/markup-compatibility/2006" xmlns:r="http://schemas.openxmlformats.org/officeDocument/2006/relationships" xmlns:w="http://schemas.openxmlformats.org/wordprocessingml/2006/main" xmlns:w14="http://schemas.microsoft.com/office/word/2010/wordml" xmlns:w15="http://schemas.microsoft.com/office/word/2012/wordml" xmlns:w16cex="http://schemas.microsoft.com/office/word/2018/wordml/cex" xmlns:w16cid="http://schemas.microsoft.com/office/word/2016/wordml/cid" xmlns:w16="http://schemas.microsoft.com/office/word/2018/wordml" xmlns:w16sdtdh="http://schemas.microsoft.com/office/word/2020/wordml/sdtdatahash" xmlns:w16se="http://schemas.microsoft.com/office/word/2015/wordml/symex" mc:Ignorable="w14 w15 w16se w16cid w16 w16cex w16sdtdh">
   <w:docDefaults>
     <w:rPrDefault>
       <w:rPr>

</xml_diff>